<commit_message>
FIX MASTER BA FISIK
</commit_message>
<xml_diff>
--- a/Master Folder/Master BA Timlak Fisik/z03. Memorandum BA Reviu Persiapan Pengadaan (Tidak Sesuai).docx
+++ b/Master Folder/Master BA Timlak Fisik/z03. Memorandum BA Reviu Persiapan Pengadaan (Tidak Sesuai).docx
@@ -1,6 +1,6 @@
 
 <file path=word/document.xml><?xml version="1.0" encoding="utf-8"?>
-<w:document xmlns:wpc="http://schemas.microsoft.com/office/word/2010/wordprocessingCanvas" xmlns:cx="http://schemas.microsoft.com/office/drawing/2014/chartex" xmlns:cx1="http://schemas.microsoft.com/office/drawing/2015/9/8/chartex" xmlns:cx2="http://schemas.microsoft.com/office/drawing/2015/10/21/chartex" xmlns:cx3="http://schemas.microsoft.com/office/drawing/2016/5/9/chartex" xmlns:cx4="http://schemas.microsoft.com/office/drawing/2016/5/10/chartex" xmlns:cx5="http://schemas.microsoft.com/office/drawing/2016/5/11/chartex" xmlns:cx6="http://schemas.microsoft.com/office/drawing/2016/5/12/chartex" xmlns:cx7="http://schemas.microsoft.com/office/drawing/2016/5/13/chartex" xmlns:cx8="http://schemas.microsoft.com/office/drawing/2016/5/14/chartex" xmlns:mc="http://schemas.openxmlformats.org/markup-compatibility/2006" xmlns:aink="http://schemas.microsoft.com/office/drawing/2016/ink" xmlns:am3d="http://schemas.microsoft.com/office/drawing/2017/model3d" xmlns:o="urn:schemas-microsoft-com:office:office" xmlns:oel="http://schemas.microsoft.com/office/2019/extlst" xmlns:r="http://schemas.openxmlformats.org/officeDocument/2006/relationships" xmlns:m="http://schemas.openxmlformats.org/officeDocument/2006/math" xmlns:v="urn:schemas-microsoft-com:vml" xmlns:wp14="http://schemas.microsoft.com/office/word/2010/wordprocessingDrawing" xmlns:wp="http://schemas.openxmlformats.org/drawingml/2006/wordprocessingDrawing" xmlns:w10="urn:schemas-microsoft-com:office:word" xmlns:w="http://schemas.openxmlformats.org/wordprocessingml/2006/main" xmlns:w14="http://schemas.microsoft.com/office/word/2010/wordml" xmlns:w15="http://schemas.microsoft.com/office/word/2012/wordml" xmlns:w16cex="http://schemas.microsoft.com/office/word/2018/wordml/cex" xmlns:w16cid="http://schemas.microsoft.com/office/word/2016/wordml/cid" xmlns:w16="http://schemas.microsoft.com/office/word/2018/wordml" xmlns:w16du="http://schemas.microsoft.com/office/word/2023/wordml/word16du" xmlns:w16sdtdh="http://schemas.microsoft.com/office/word/2020/wordml/sdtdatahash" xmlns:w16sdtfl="http://schemas.microsoft.com/office/word/2024/wordml/sdtformatlock" xmlns:w16se="http://schemas.microsoft.com/office/word/2015/wordml/symex" xmlns:wpg="http://schemas.microsoft.com/office/word/2010/wordprocessingGroup" xmlns:wpi="http://schemas.microsoft.com/office/word/2010/wordprocessingInk" xmlns:wne="http://schemas.microsoft.com/office/word/2006/wordml" xmlns:wps="http://schemas.microsoft.com/office/word/2010/wordprocessingShape" mc:Ignorable="w14 w15 w16se w16cid w16 w16cex w16sdtdh w16sdtfl w16du wp14">
+<w:document xmlns:wpc="http://schemas.microsoft.com/office/word/2010/wordprocessingCanvas" xmlns:cx="http://schemas.microsoft.com/office/drawing/2014/chartex" xmlns:cx1="http://schemas.microsoft.com/office/drawing/2015/9/8/chartex" xmlns:cx2="http://schemas.microsoft.com/office/drawing/2015/10/21/chartex" xmlns:cx3="http://schemas.microsoft.com/office/drawing/2016/5/9/chartex" xmlns:cx4="http://schemas.microsoft.com/office/drawing/2016/5/10/chartex" xmlns:cx5="http://schemas.microsoft.com/office/drawing/2016/5/11/chartex" xmlns:cx6="http://schemas.microsoft.com/office/drawing/2016/5/12/chartex" xmlns:cx7="http://schemas.microsoft.com/office/drawing/2016/5/13/chartex" xmlns:cx8="http://schemas.microsoft.com/office/drawing/2016/5/14/chartex" xmlns:mc="http://schemas.openxmlformats.org/markup-compatibility/2006" xmlns:aink="http://schemas.microsoft.com/office/drawing/2016/ink" xmlns:am3d="http://schemas.microsoft.com/office/drawing/2017/model3d" xmlns:o="urn:schemas-microsoft-com:office:office" xmlns:r="http://schemas.openxmlformats.org/officeDocument/2006/relationships" xmlns:m="http://schemas.openxmlformats.org/officeDocument/2006/math" xmlns:v="urn:schemas-microsoft-com:vml" xmlns:wp14="http://schemas.microsoft.com/office/word/2010/wordprocessingDrawing" xmlns:wp="http://schemas.openxmlformats.org/drawingml/2006/wordprocessingDrawing" xmlns:w10="urn:schemas-microsoft-com:office:word" xmlns:w="http://schemas.openxmlformats.org/wordprocessingml/2006/main" xmlns:w14="http://schemas.microsoft.com/office/word/2010/wordml" xmlns:w15="http://schemas.microsoft.com/office/word/2012/wordml" xmlns:w16cex="http://schemas.microsoft.com/office/word/2018/wordml/cex" xmlns:w16cid="http://schemas.microsoft.com/office/word/2016/wordml/cid" xmlns:w16="http://schemas.microsoft.com/office/word/2018/wordml" xmlns:w16sdtdh="http://schemas.microsoft.com/office/word/2020/wordml/sdtdatahash" xmlns:w16se="http://schemas.microsoft.com/office/word/2015/wordml/symex" xmlns:wpg="http://schemas.microsoft.com/office/word/2010/wordprocessingGroup" xmlns:wpi="http://schemas.microsoft.com/office/word/2010/wordprocessingInk" xmlns:wne="http://schemas.microsoft.com/office/word/2006/wordml" xmlns:wps="http://schemas.microsoft.com/office/word/2010/wordprocessingShape" mc:Ignorable="w14 w15 w16se w16cid w16 w16cex w16sdtdh wp14">
   <w:body>
     <w:p>
       <w:pPr>
@@ -176,7 +176,23 @@
                 <w:bCs/>
                 <w:lang w:val="en-US"/>
               </w:rPr>
-              <w:t>Kepala {satuan_kerja}</w:t>
+              <w:t>{</w:t>
+            </w:r>
+            <w:r>
+              <w:rPr>
+                <w:rFonts w:ascii="Arial" w:hAnsi="Arial" w:cs="Arial"/>
+                <w:bCs/>
+                <w:lang w:val="en-US"/>
+              </w:rPr>
+              <w:t>ppk</w:t>
+            </w:r>
+            <w:r>
+              <w:rPr>
+                <w:rFonts w:ascii="Arial" w:hAnsi="Arial" w:cs="Arial"/>
+                <w:bCs/>
+                <w:lang w:val="en-US"/>
+              </w:rPr>
+              <w:t>}</w:t>
             </w:r>
           </w:p>
         </w:tc>
@@ -948,7 +964,28 @@
           <w:rFonts w:ascii="Arial" w:hAnsi="Arial" w:cs="Arial"/>
           <w:lang w:val="sv-SE"/>
         </w:rPr>
-        <w:t>{ppk}</w:t>
+        <w:t xml:space="preserve">Kepala </w:t>
+      </w:r>
+      <w:r>
+        <w:rPr>
+          <w:rFonts w:ascii="Arial" w:hAnsi="Arial" w:cs="Arial"/>
+          <w:lang w:val="sv-SE"/>
+        </w:rPr>
+        <w:t>{</w:t>
+      </w:r>
+      <w:r>
+        <w:rPr>
+          <w:rFonts w:ascii="Arial" w:hAnsi="Arial" w:cs="Arial"/>
+          <w:lang w:val="sv-SE"/>
+        </w:rPr>
+        <w:t>satuan_kerja</w:t>
+      </w:r>
+      <w:r>
+        <w:rPr>
+          <w:rFonts w:ascii="Arial" w:hAnsi="Arial" w:cs="Arial"/>
+          <w:lang w:val="sv-SE"/>
+        </w:rPr>
+        <w:t>}</w:t>
       </w:r>
     </w:p>
     <w:p>
@@ -1063,7 +1100,7 @@
 </file>
 
 <file path=word/endnotes.xml><?xml version="1.0" encoding="utf-8"?>
-<w:endnotes xmlns:wpc="http://schemas.microsoft.com/office/word/2010/wordprocessingCanvas" xmlns:cx="http://schemas.microsoft.com/office/drawing/2014/chartex" xmlns:cx1="http://schemas.microsoft.com/office/drawing/2015/9/8/chartex" xmlns:cx2="http://schemas.microsoft.com/office/drawing/2015/10/21/chartex" xmlns:cx3="http://schemas.microsoft.com/office/drawing/2016/5/9/chartex" xmlns:cx4="http://schemas.microsoft.com/office/drawing/2016/5/10/chartex" xmlns:cx5="http://schemas.microsoft.com/office/drawing/2016/5/11/chartex" xmlns:cx6="http://schemas.microsoft.com/office/drawing/2016/5/12/chartex" xmlns:cx7="http://schemas.microsoft.com/office/drawing/2016/5/13/chartex" xmlns:cx8="http://schemas.microsoft.com/office/drawing/2016/5/14/chartex" xmlns:mc="http://schemas.openxmlformats.org/markup-compatibility/2006" xmlns:aink="http://schemas.microsoft.com/office/drawing/2016/ink" xmlns:am3d="http://schemas.microsoft.com/office/drawing/2017/model3d" xmlns:o="urn:schemas-microsoft-com:office:office" xmlns:oel="http://schemas.microsoft.com/office/2019/extlst" xmlns:r="http://schemas.openxmlformats.org/officeDocument/2006/relationships" xmlns:m="http://schemas.openxmlformats.org/officeDocument/2006/math" xmlns:v="urn:schemas-microsoft-com:vml" xmlns:wp14="http://schemas.microsoft.com/office/word/2010/wordprocessingDrawing" xmlns:wp="http://schemas.openxmlformats.org/drawingml/2006/wordprocessingDrawing" xmlns:w10="urn:schemas-microsoft-com:office:word" xmlns:w="http://schemas.openxmlformats.org/wordprocessingml/2006/main" xmlns:w14="http://schemas.microsoft.com/office/word/2010/wordml" xmlns:w15="http://schemas.microsoft.com/office/word/2012/wordml" xmlns:w16cex="http://schemas.microsoft.com/office/word/2018/wordml/cex" xmlns:w16cid="http://schemas.microsoft.com/office/word/2016/wordml/cid" xmlns:w16="http://schemas.microsoft.com/office/word/2018/wordml" xmlns:w16du="http://schemas.microsoft.com/office/word/2023/wordml/word16du" xmlns:w16sdtdh="http://schemas.microsoft.com/office/word/2020/wordml/sdtdatahash" xmlns:w16sdtfl="http://schemas.microsoft.com/office/word/2024/wordml/sdtformatlock" xmlns:w16se="http://schemas.microsoft.com/office/word/2015/wordml/symex" xmlns:wpg="http://schemas.microsoft.com/office/word/2010/wordprocessingGroup" xmlns:wpi="http://schemas.microsoft.com/office/word/2010/wordprocessingInk" xmlns:wne="http://schemas.microsoft.com/office/word/2006/wordml" xmlns:wps="http://schemas.microsoft.com/office/word/2010/wordprocessingShape" mc:Ignorable="w14 w15 w16se w16cid w16 w16cex w16sdtdh w16sdtfl w16du wp14">
+<w:endnotes xmlns:wpc="http://schemas.microsoft.com/office/word/2010/wordprocessingCanvas" xmlns:cx="http://schemas.microsoft.com/office/drawing/2014/chartex" xmlns:cx1="http://schemas.microsoft.com/office/drawing/2015/9/8/chartex" xmlns:cx2="http://schemas.microsoft.com/office/drawing/2015/10/21/chartex" xmlns:cx3="http://schemas.microsoft.com/office/drawing/2016/5/9/chartex" xmlns:cx4="http://schemas.microsoft.com/office/drawing/2016/5/10/chartex" xmlns:cx5="http://schemas.microsoft.com/office/drawing/2016/5/11/chartex" xmlns:cx6="http://schemas.microsoft.com/office/drawing/2016/5/12/chartex" xmlns:cx7="http://schemas.microsoft.com/office/drawing/2016/5/13/chartex" xmlns:cx8="http://schemas.microsoft.com/office/drawing/2016/5/14/chartex" xmlns:mc="http://schemas.openxmlformats.org/markup-compatibility/2006" xmlns:aink="http://schemas.microsoft.com/office/drawing/2016/ink" xmlns:am3d="http://schemas.microsoft.com/office/drawing/2017/model3d" xmlns:o="urn:schemas-microsoft-com:office:office" xmlns:r="http://schemas.openxmlformats.org/officeDocument/2006/relationships" xmlns:m="http://schemas.openxmlformats.org/officeDocument/2006/math" xmlns:v="urn:schemas-microsoft-com:vml" xmlns:wp14="http://schemas.microsoft.com/office/word/2010/wordprocessingDrawing" xmlns:wp="http://schemas.openxmlformats.org/drawingml/2006/wordprocessingDrawing" xmlns:w10="urn:schemas-microsoft-com:office:word" xmlns:w="http://schemas.openxmlformats.org/wordprocessingml/2006/main" xmlns:w14="http://schemas.microsoft.com/office/word/2010/wordml" xmlns:w15="http://schemas.microsoft.com/office/word/2012/wordml" xmlns:w16cex="http://schemas.microsoft.com/office/word/2018/wordml/cex" xmlns:w16cid="http://schemas.microsoft.com/office/word/2016/wordml/cid" xmlns:w16="http://schemas.microsoft.com/office/word/2018/wordml" xmlns:w16sdtdh="http://schemas.microsoft.com/office/word/2020/wordml/sdtdatahash" xmlns:w16se="http://schemas.microsoft.com/office/word/2015/wordml/symex" xmlns:wpg="http://schemas.microsoft.com/office/word/2010/wordprocessingGroup" xmlns:wpi="http://schemas.microsoft.com/office/word/2010/wordprocessingInk" xmlns:wne="http://schemas.microsoft.com/office/word/2006/wordml" xmlns:wps="http://schemas.microsoft.com/office/word/2010/wordprocessingShape" mc:Ignorable="w14 w15 w16se w16cid w16 w16cex w16sdtdh wp14">
   <w:endnote w:type="separator" w:id="-1">
     <w:p>
       <w:pPr>
@@ -1088,7 +1125,7 @@
 </file>
 
 <file path=word/footer1.xml><?xml version="1.0" encoding="utf-8"?>
-<w:ftr xmlns:wpc="http://schemas.microsoft.com/office/word/2010/wordprocessingCanvas" xmlns:cx="http://schemas.microsoft.com/office/drawing/2014/chartex" xmlns:cx1="http://schemas.microsoft.com/office/drawing/2015/9/8/chartex" xmlns:cx2="http://schemas.microsoft.com/office/drawing/2015/10/21/chartex" xmlns:cx3="http://schemas.microsoft.com/office/drawing/2016/5/9/chartex" xmlns:cx4="http://schemas.microsoft.com/office/drawing/2016/5/10/chartex" xmlns:cx5="http://schemas.microsoft.com/office/drawing/2016/5/11/chartex" xmlns:cx6="http://schemas.microsoft.com/office/drawing/2016/5/12/chartex" xmlns:cx7="http://schemas.microsoft.com/office/drawing/2016/5/13/chartex" xmlns:cx8="http://schemas.microsoft.com/office/drawing/2016/5/14/chartex" xmlns:mc="http://schemas.openxmlformats.org/markup-compatibility/2006" xmlns:aink="http://schemas.microsoft.com/office/drawing/2016/ink" xmlns:am3d="http://schemas.microsoft.com/office/drawing/2017/model3d" xmlns:o="urn:schemas-microsoft-com:office:office" xmlns:oel="http://schemas.microsoft.com/office/2019/extlst" xmlns:r="http://schemas.openxmlformats.org/officeDocument/2006/relationships" xmlns:m="http://schemas.openxmlformats.org/officeDocument/2006/math" xmlns:v="urn:schemas-microsoft-com:vml" xmlns:wp14="http://schemas.microsoft.com/office/word/2010/wordprocessingDrawing" xmlns:wp="http://schemas.openxmlformats.org/drawingml/2006/wordprocessingDrawing" xmlns:w10="urn:schemas-microsoft-com:office:word" xmlns:w="http://schemas.openxmlformats.org/wordprocessingml/2006/main" xmlns:w14="http://schemas.microsoft.com/office/word/2010/wordml" xmlns:w15="http://schemas.microsoft.com/office/word/2012/wordml" xmlns:w16cex="http://schemas.microsoft.com/office/word/2018/wordml/cex" xmlns:w16cid="http://schemas.microsoft.com/office/word/2016/wordml/cid" xmlns:w16="http://schemas.microsoft.com/office/word/2018/wordml" xmlns:w16du="http://schemas.microsoft.com/office/word/2023/wordml/word16du" xmlns:w16sdtdh="http://schemas.microsoft.com/office/word/2020/wordml/sdtdatahash" xmlns:w16sdtfl="http://schemas.microsoft.com/office/word/2024/wordml/sdtformatlock" xmlns:w16se="http://schemas.microsoft.com/office/word/2015/wordml/symex" xmlns:wpg="http://schemas.microsoft.com/office/word/2010/wordprocessingGroup" xmlns:wpi="http://schemas.microsoft.com/office/word/2010/wordprocessingInk" xmlns:wne="http://schemas.microsoft.com/office/word/2006/wordml" xmlns:wps="http://schemas.microsoft.com/office/word/2010/wordprocessingShape" mc:Ignorable="w14 w15 w16se w16cid w16 w16cex w16sdtdh w16sdtfl w16du wp14">
+<w:ftr xmlns:wpc="http://schemas.microsoft.com/office/word/2010/wordprocessingCanvas" xmlns:cx="http://schemas.microsoft.com/office/drawing/2014/chartex" xmlns:cx1="http://schemas.microsoft.com/office/drawing/2015/9/8/chartex" xmlns:cx2="http://schemas.microsoft.com/office/drawing/2015/10/21/chartex" xmlns:cx3="http://schemas.microsoft.com/office/drawing/2016/5/9/chartex" xmlns:cx4="http://schemas.microsoft.com/office/drawing/2016/5/10/chartex" xmlns:cx5="http://schemas.microsoft.com/office/drawing/2016/5/11/chartex" xmlns:cx6="http://schemas.microsoft.com/office/drawing/2016/5/12/chartex" xmlns:cx7="http://schemas.microsoft.com/office/drawing/2016/5/13/chartex" xmlns:cx8="http://schemas.microsoft.com/office/drawing/2016/5/14/chartex" xmlns:mc="http://schemas.openxmlformats.org/markup-compatibility/2006" xmlns:aink="http://schemas.microsoft.com/office/drawing/2016/ink" xmlns:am3d="http://schemas.microsoft.com/office/drawing/2017/model3d" xmlns:o="urn:schemas-microsoft-com:office:office" xmlns:r="http://schemas.openxmlformats.org/officeDocument/2006/relationships" xmlns:m="http://schemas.openxmlformats.org/officeDocument/2006/math" xmlns:v="urn:schemas-microsoft-com:vml" xmlns:wp14="http://schemas.microsoft.com/office/word/2010/wordprocessingDrawing" xmlns:wp="http://schemas.openxmlformats.org/drawingml/2006/wordprocessingDrawing" xmlns:w10="urn:schemas-microsoft-com:office:word" xmlns:w="http://schemas.openxmlformats.org/wordprocessingml/2006/main" xmlns:w14="http://schemas.microsoft.com/office/word/2010/wordml" xmlns:w15="http://schemas.microsoft.com/office/word/2012/wordml" xmlns:w16cex="http://schemas.microsoft.com/office/word/2018/wordml/cex" xmlns:w16cid="http://schemas.microsoft.com/office/word/2016/wordml/cid" xmlns:w16="http://schemas.microsoft.com/office/word/2018/wordml" xmlns:w16sdtdh="http://schemas.microsoft.com/office/word/2020/wordml/sdtdatahash" xmlns:w16se="http://schemas.microsoft.com/office/word/2015/wordml/symex" xmlns:wpg="http://schemas.microsoft.com/office/word/2010/wordprocessingGroup" xmlns:wpi="http://schemas.microsoft.com/office/word/2010/wordprocessingInk" xmlns:wne="http://schemas.microsoft.com/office/word/2006/wordml" xmlns:wps="http://schemas.microsoft.com/office/word/2010/wordprocessingShape" mc:Ignorable="w14 w15 w16se w16cid w16 w16cex w16sdtdh wp14">
   <w:p>
     <w:pPr>
       <w:pStyle w:val="Footer"/>
@@ -1098,7 +1135,7 @@
 </file>
 
 <file path=word/footer2.xml><?xml version="1.0" encoding="utf-8"?>
-<w:ftr xmlns:wpc="http://schemas.microsoft.com/office/word/2010/wordprocessingCanvas" xmlns:cx="http://schemas.microsoft.com/office/drawing/2014/chartex" xmlns:cx1="http://schemas.microsoft.com/office/drawing/2015/9/8/chartex" xmlns:cx2="http://schemas.microsoft.com/office/drawing/2015/10/21/chartex" xmlns:cx3="http://schemas.microsoft.com/office/drawing/2016/5/9/chartex" xmlns:cx4="http://schemas.microsoft.com/office/drawing/2016/5/10/chartex" xmlns:cx5="http://schemas.microsoft.com/office/drawing/2016/5/11/chartex" xmlns:cx6="http://schemas.microsoft.com/office/drawing/2016/5/12/chartex" xmlns:cx7="http://schemas.microsoft.com/office/drawing/2016/5/13/chartex" xmlns:cx8="http://schemas.microsoft.com/office/drawing/2016/5/14/chartex" xmlns:mc="http://schemas.openxmlformats.org/markup-compatibility/2006" xmlns:aink="http://schemas.microsoft.com/office/drawing/2016/ink" xmlns:am3d="http://schemas.microsoft.com/office/drawing/2017/model3d" xmlns:o="urn:schemas-microsoft-com:office:office" xmlns:oel="http://schemas.microsoft.com/office/2019/extlst" xmlns:r="http://schemas.openxmlformats.org/officeDocument/2006/relationships" xmlns:m="http://schemas.openxmlformats.org/officeDocument/2006/math" xmlns:v="urn:schemas-microsoft-com:vml" xmlns:wp14="http://schemas.microsoft.com/office/word/2010/wordprocessingDrawing" xmlns:wp="http://schemas.openxmlformats.org/drawingml/2006/wordprocessingDrawing" xmlns:w10="urn:schemas-microsoft-com:office:word" xmlns:w="http://schemas.openxmlformats.org/wordprocessingml/2006/main" xmlns:w14="http://schemas.microsoft.com/office/word/2010/wordml" xmlns:w15="http://schemas.microsoft.com/office/word/2012/wordml" xmlns:w16cex="http://schemas.microsoft.com/office/word/2018/wordml/cex" xmlns:w16cid="http://schemas.microsoft.com/office/word/2016/wordml/cid" xmlns:w16="http://schemas.microsoft.com/office/word/2018/wordml" xmlns:w16du="http://schemas.microsoft.com/office/word/2023/wordml/word16du" xmlns:w16sdtdh="http://schemas.microsoft.com/office/word/2020/wordml/sdtdatahash" xmlns:w16sdtfl="http://schemas.microsoft.com/office/word/2024/wordml/sdtformatlock" xmlns:w16se="http://schemas.microsoft.com/office/word/2015/wordml/symex" xmlns:wpg="http://schemas.microsoft.com/office/word/2010/wordprocessingGroup" xmlns:wpi="http://schemas.microsoft.com/office/word/2010/wordprocessingInk" xmlns:wne="http://schemas.microsoft.com/office/word/2006/wordml" xmlns:wps="http://schemas.microsoft.com/office/word/2010/wordprocessingShape" mc:Ignorable="w14 w15 w16se w16cid w16 w16cex w16sdtdh w16sdtfl w16du wp14">
+<w:ftr xmlns:wpc="http://schemas.microsoft.com/office/word/2010/wordprocessingCanvas" xmlns:cx="http://schemas.microsoft.com/office/drawing/2014/chartex" xmlns:cx1="http://schemas.microsoft.com/office/drawing/2015/9/8/chartex" xmlns:cx2="http://schemas.microsoft.com/office/drawing/2015/10/21/chartex" xmlns:cx3="http://schemas.microsoft.com/office/drawing/2016/5/9/chartex" xmlns:cx4="http://schemas.microsoft.com/office/drawing/2016/5/10/chartex" xmlns:cx5="http://schemas.microsoft.com/office/drawing/2016/5/11/chartex" xmlns:cx6="http://schemas.microsoft.com/office/drawing/2016/5/12/chartex" xmlns:cx7="http://schemas.microsoft.com/office/drawing/2016/5/13/chartex" xmlns:cx8="http://schemas.microsoft.com/office/drawing/2016/5/14/chartex" xmlns:mc="http://schemas.openxmlformats.org/markup-compatibility/2006" xmlns:aink="http://schemas.microsoft.com/office/drawing/2016/ink" xmlns:am3d="http://schemas.microsoft.com/office/drawing/2017/model3d" xmlns:o="urn:schemas-microsoft-com:office:office" xmlns:r="http://schemas.openxmlformats.org/officeDocument/2006/relationships" xmlns:m="http://schemas.openxmlformats.org/officeDocument/2006/math" xmlns:v="urn:schemas-microsoft-com:vml" xmlns:wp14="http://schemas.microsoft.com/office/word/2010/wordprocessingDrawing" xmlns:wp="http://schemas.openxmlformats.org/drawingml/2006/wordprocessingDrawing" xmlns:w10="urn:schemas-microsoft-com:office:word" xmlns:w="http://schemas.openxmlformats.org/wordprocessingml/2006/main" xmlns:w14="http://schemas.microsoft.com/office/word/2010/wordml" xmlns:w15="http://schemas.microsoft.com/office/word/2012/wordml" xmlns:w16cex="http://schemas.microsoft.com/office/word/2018/wordml/cex" xmlns:w16cid="http://schemas.microsoft.com/office/word/2016/wordml/cid" xmlns:w16="http://schemas.microsoft.com/office/word/2018/wordml" xmlns:w16sdtdh="http://schemas.microsoft.com/office/word/2020/wordml/sdtdatahash" xmlns:w16se="http://schemas.microsoft.com/office/word/2015/wordml/symex" xmlns:wpg="http://schemas.microsoft.com/office/word/2010/wordprocessingGroup" xmlns:wpi="http://schemas.microsoft.com/office/word/2010/wordprocessingInk" xmlns:wne="http://schemas.microsoft.com/office/word/2006/wordml" xmlns:wps="http://schemas.microsoft.com/office/word/2010/wordprocessingShape" mc:Ignorable="w14 w15 w16se w16cid w16 w16cex w16sdtdh wp14">
   <w:p>
     <w:pPr>
       <w:pStyle w:val="Footer"/>
@@ -1155,7 +1192,7 @@
 </file>
 
 <file path=word/footer3.xml><?xml version="1.0" encoding="utf-8"?>
-<w:ftr xmlns:wpc="http://schemas.microsoft.com/office/word/2010/wordprocessingCanvas" xmlns:cx="http://schemas.microsoft.com/office/drawing/2014/chartex" xmlns:cx1="http://schemas.microsoft.com/office/drawing/2015/9/8/chartex" xmlns:cx2="http://schemas.microsoft.com/office/drawing/2015/10/21/chartex" xmlns:cx3="http://schemas.microsoft.com/office/drawing/2016/5/9/chartex" xmlns:cx4="http://schemas.microsoft.com/office/drawing/2016/5/10/chartex" xmlns:cx5="http://schemas.microsoft.com/office/drawing/2016/5/11/chartex" xmlns:cx6="http://schemas.microsoft.com/office/drawing/2016/5/12/chartex" xmlns:cx7="http://schemas.microsoft.com/office/drawing/2016/5/13/chartex" xmlns:cx8="http://schemas.microsoft.com/office/drawing/2016/5/14/chartex" xmlns:mc="http://schemas.openxmlformats.org/markup-compatibility/2006" xmlns:aink="http://schemas.microsoft.com/office/drawing/2016/ink" xmlns:am3d="http://schemas.microsoft.com/office/drawing/2017/model3d" xmlns:o="urn:schemas-microsoft-com:office:office" xmlns:oel="http://schemas.microsoft.com/office/2019/extlst" xmlns:r="http://schemas.openxmlformats.org/officeDocument/2006/relationships" xmlns:m="http://schemas.openxmlformats.org/officeDocument/2006/math" xmlns:v="urn:schemas-microsoft-com:vml" xmlns:wp14="http://schemas.microsoft.com/office/word/2010/wordprocessingDrawing" xmlns:wp="http://schemas.openxmlformats.org/drawingml/2006/wordprocessingDrawing" xmlns:w10="urn:schemas-microsoft-com:office:word" xmlns:w="http://schemas.openxmlformats.org/wordprocessingml/2006/main" xmlns:w14="http://schemas.microsoft.com/office/word/2010/wordml" xmlns:w15="http://schemas.microsoft.com/office/word/2012/wordml" xmlns:w16cex="http://schemas.microsoft.com/office/word/2018/wordml/cex" xmlns:w16cid="http://schemas.microsoft.com/office/word/2016/wordml/cid" xmlns:w16="http://schemas.microsoft.com/office/word/2018/wordml" xmlns:w16du="http://schemas.microsoft.com/office/word/2023/wordml/word16du" xmlns:w16sdtdh="http://schemas.microsoft.com/office/word/2020/wordml/sdtdatahash" xmlns:w16sdtfl="http://schemas.microsoft.com/office/word/2024/wordml/sdtformatlock" xmlns:w16se="http://schemas.microsoft.com/office/word/2015/wordml/symex" xmlns:wpg="http://schemas.microsoft.com/office/word/2010/wordprocessingGroup" xmlns:wpi="http://schemas.microsoft.com/office/word/2010/wordprocessingInk" xmlns:wne="http://schemas.microsoft.com/office/word/2006/wordml" xmlns:wps="http://schemas.microsoft.com/office/word/2010/wordprocessingShape" mc:Ignorable="w14 w15 w16se w16cid w16 w16cex w16sdtdh w16sdtfl w16du wp14">
+<w:ftr xmlns:wpc="http://schemas.microsoft.com/office/word/2010/wordprocessingCanvas" xmlns:cx="http://schemas.microsoft.com/office/drawing/2014/chartex" xmlns:cx1="http://schemas.microsoft.com/office/drawing/2015/9/8/chartex" xmlns:cx2="http://schemas.microsoft.com/office/drawing/2015/10/21/chartex" xmlns:cx3="http://schemas.microsoft.com/office/drawing/2016/5/9/chartex" xmlns:cx4="http://schemas.microsoft.com/office/drawing/2016/5/10/chartex" xmlns:cx5="http://schemas.microsoft.com/office/drawing/2016/5/11/chartex" xmlns:cx6="http://schemas.microsoft.com/office/drawing/2016/5/12/chartex" xmlns:cx7="http://schemas.microsoft.com/office/drawing/2016/5/13/chartex" xmlns:cx8="http://schemas.microsoft.com/office/drawing/2016/5/14/chartex" xmlns:mc="http://schemas.openxmlformats.org/markup-compatibility/2006" xmlns:aink="http://schemas.microsoft.com/office/drawing/2016/ink" xmlns:am3d="http://schemas.microsoft.com/office/drawing/2017/model3d" xmlns:o="urn:schemas-microsoft-com:office:office" xmlns:r="http://schemas.openxmlformats.org/officeDocument/2006/relationships" xmlns:m="http://schemas.openxmlformats.org/officeDocument/2006/math" xmlns:v="urn:schemas-microsoft-com:vml" xmlns:wp14="http://schemas.microsoft.com/office/word/2010/wordprocessingDrawing" xmlns:wp="http://schemas.openxmlformats.org/drawingml/2006/wordprocessingDrawing" xmlns:w10="urn:schemas-microsoft-com:office:word" xmlns:w="http://schemas.openxmlformats.org/wordprocessingml/2006/main" xmlns:w14="http://schemas.microsoft.com/office/word/2010/wordml" xmlns:w15="http://schemas.microsoft.com/office/word/2012/wordml" xmlns:w16cex="http://schemas.microsoft.com/office/word/2018/wordml/cex" xmlns:w16cid="http://schemas.microsoft.com/office/word/2016/wordml/cid" xmlns:w16="http://schemas.microsoft.com/office/word/2018/wordml" xmlns:w16sdtdh="http://schemas.microsoft.com/office/word/2020/wordml/sdtdatahash" xmlns:w16se="http://schemas.microsoft.com/office/word/2015/wordml/symex" xmlns:wpg="http://schemas.microsoft.com/office/word/2010/wordprocessingGroup" xmlns:wpi="http://schemas.microsoft.com/office/word/2010/wordprocessingInk" xmlns:wne="http://schemas.microsoft.com/office/word/2006/wordml" xmlns:wps="http://schemas.microsoft.com/office/word/2010/wordprocessingShape" mc:Ignorable="w14 w15 w16se w16cid w16 w16cex w16sdtdh wp14">
   <w:p>
     <w:pPr>
       <w:pStyle w:val="Footer"/>
@@ -1165,7 +1202,7 @@
 </file>
 
 <file path=word/footnotes.xml><?xml version="1.0" encoding="utf-8"?>
-<w:footnotes xmlns:wpc="http://schemas.microsoft.com/office/word/2010/wordprocessingCanvas" xmlns:cx="http://schemas.microsoft.com/office/drawing/2014/chartex" xmlns:cx1="http://schemas.microsoft.com/office/drawing/2015/9/8/chartex" xmlns:cx2="http://schemas.microsoft.com/office/drawing/2015/10/21/chartex" xmlns:cx3="http://schemas.microsoft.com/office/drawing/2016/5/9/chartex" xmlns:cx4="http://schemas.microsoft.com/office/drawing/2016/5/10/chartex" xmlns:cx5="http://schemas.microsoft.com/office/drawing/2016/5/11/chartex" xmlns:cx6="http://schemas.microsoft.com/office/drawing/2016/5/12/chartex" xmlns:cx7="http://schemas.microsoft.com/office/drawing/2016/5/13/chartex" xmlns:cx8="http://schemas.microsoft.com/office/drawing/2016/5/14/chartex" xmlns:mc="http://schemas.openxmlformats.org/markup-compatibility/2006" xmlns:aink="http://schemas.microsoft.com/office/drawing/2016/ink" xmlns:am3d="http://schemas.microsoft.com/office/drawing/2017/model3d" xmlns:o="urn:schemas-microsoft-com:office:office" xmlns:oel="http://schemas.microsoft.com/office/2019/extlst" xmlns:r="http://schemas.openxmlformats.org/officeDocument/2006/relationships" xmlns:m="http://schemas.openxmlformats.org/officeDocument/2006/math" xmlns:v="urn:schemas-microsoft-com:vml" xmlns:wp14="http://schemas.microsoft.com/office/word/2010/wordprocessingDrawing" xmlns:wp="http://schemas.openxmlformats.org/drawingml/2006/wordprocessingDrawing" xmlns:w10="urn:schemas-microsoft-com:office:word" xmlns:w="http://schemas.openxmlformats.org/wordprocessingml/2006/main" xmlns:w14="http://schemas.microsoft.com/office/word/2010/wordml" xmlns:w15="http://schemas.microsoft.com/office/word/2012/wordml" xmlns:w16cex="http://schemas.microsoft.com/office/word/2018/wordml/cex" xmlns:w16cid="http://schemas.microsoft.com/office/word/2016/wordml/cid" xmlns:w16="http://schemas.microsoft.com/office/word/2018/wordml" xmlns:w16du="http://schemas.microsoft.com/office/word/2023/wordml/word16du" xmlns:w16sdtdh="http://schemas.microsoft.com/office/word/2020/wordml/sdtdatahash" xmlns:w16sdtfl="http://schemas.microsoft.com/office/word/2024/wordml/sdtformatlock" xmlns:w16se="http://schemas.microsoft.com/office/word/2015/wordml/symex" xmlns:wpg="http://schemas.microsoft.com/office/word/2010/wordprocessingGroup" xmlns:wpi="http://schemas.microsoft.com/office/word/2010/wordprocessingInk" xmlns:wne="http://schemas.microsoft.com/office/word/2006/wordml" xmlns:wps="http://schemas.microsoft.com/office/word/2010/wordprocessingShape" mc:Ignorable="w14 w15 w16se w16cid w16 w16cex w16sdtdh w16sdtfl w16du wp14">
+<w:footnotes xmlns:wpc="http://schemas.microsoft.com/office/word/2010/wordprocessingCanvas" xmlns:cx="http://schemas.microsoft.com/office/drawing/2014/chartex" xmlns:cx1="http://schemas.microsoft.com/office/drawing/2015/9/8/chartex" xmlns:cx2="http://schemas.microsoft.com/office/drawing/2015/10/21/chartex" xmlns:cx3="http://schemas.microsoft.com/office/drawing/2016/5/9/chartex" xmlns:cx4="http://schemas.microsoft.com/office/drawing/2016/5/10/chartex" xmlns:cx5="http://schemas.microsoft.com/office/drawing/2016/5/11/chartex" xmlns:cx6="http://schemas.microsoft.com/office/drawing/2016/5/12/chartex" xmlns:cx7="http://schemas.microsoft.com/office/drawing/2016/5/13/chartex" xmlns:cx8="http://schemas.microsoft.com/office/drawing/2016/5/14/chartex" xmlns:mc="http://schemas.openxmlformats.org/markup-compatibility/2006" xmlns:aink="http://schemas.microsoft.com/office/drawing/2016/ink" xmlns:am3d="http://schemas.microsoft.com/office/drawing/2017/model3d" xmlns:o="urn:schemas-microsoft-com:office:office" xmlns:r="http://schemas.openxmlformats.org/officeDocument/2006/relationships" xmlns:m="http://schemas.openxmlformats.org/officeDocument/2006/math" xmlns:v="urn:schemas-microsoft-com:vml" xmlns:wp14="http://schemas.microsoft.com/office/word/2010/wordprocessingDrawing" xmlns:wp="http://schemas.openxmlformats.org/drawingml/2006/wordprocessingDrawing" xmlns:w10="urn:schemas-microsoft-com:office:word" xmlns:w="http://schemas.openxmlformats.org/wordprocessingml/2006/main" xmlns:w14="http://schemas.microsoft.com/office/word/2010/wordml" xmlns:w15="http://schemas.microsoft.com/office/word/2012/wordml" xmlns:w16cex="http://schemas.microsoft.com/office/word/2018/wordml/cex" xmlns:w16cid="http://schemas.microsoft.com/office/word/2016/wordml/cid" xmlns:w16="http://schemas.microsoft.com/office/word/2018/wordml" xmlns:w16sdtdh="http://schemas.microsoft.com/office/word/2020/wordml/sdtdatahash" xmlns:w16se="http://schemas.microsoft.com/office/word/2015/wordml/symex" xmlns:wpg="http://schemas.microsoft.com/office/word/2010/wordprocessingGroup" xmlns:wpi="http://schemas.microsoft.com/office/word/2010/wordprocessingInk" xmlns:wne="http://schemas.microsoft.com/office/word/2006/wordml" xmlns:wps="http://schemas.microsoft.com/office/word/2010/wordprocessingShape" mc:Ignorable="w14 w15 w16se w16cid w16 w16cex w16sdtdh wp14">
   <w:footnote w:type="separator" w:id="-1">
     <w:p>
       <w:pPr>
@@ -1190,7 +1227,7 @@
 </file>
 
 <file path=word/header1.xml><?xml version="1.0" encoding="utf-8"?>
-<w:hdr xmlns:wpc="http://schemas.microsoft.com/office/word/2010/wordprocessingCanvas" xmlns:cx="http://schemas.microsoft.com/office/drawing/2014/chartex" xmlns:cx1="http://schemas.microsoft.com/office/drawing/2015/9/8/chartex" xmlns:cx2="http://schemas.microsoft.com/office/drawing/2015/10/21/chartex" xmlns:cx3="http://schemas.microsoft.com/office/drawing/2016/5/9/chartex" xmlns:cx4="http://schemas.microsoft.com/office/drawing/2016/5/10/chartex" xmlns:cx5="http://schemas.microsoft.com/office/drawing/2016/5/11/chartex" xmlns:cx6="http://schemas.microsoft.com/office/drawing/2016/5/12/chartex" xmlns:cx7="http://schemas.microsoft.com/office/drawing/2016/5/13/chartex" xmlns:cx8="http://schemas.microsoft.com/office/drawing/2016/5/14/chartex" xmlns:mc="http://schemas.openxmlformats.org/markup-compatibility/2006" xmlns:aink="http://schemas.microsoft.com/office/drawing/2016/ink" xmlns:am3d="http://schemas.microsoft.com/office/drawing/2017/model3d" xmlns:o="urn:schemas-microsoft-com:office:office" xmlns:oel="http://schemas.microsoft.com/office/2019/extlst" xmlns:r="http://schemas.openxmlformats.org/officeDocument/2006/relationships" xmlns:m="http://schemas.openxmlformats.org/officeDocument/2006/math" xmlns:v="urn:schemas-microsoft-com:vml" xmlns:wp14="http://schemas.microsoft.com/office/word/2010/wordprocessingDrawing" xmlns:wp="http://schemas.openxmlformats.org/drawingml/2006/wordprocessingDrawing" xmlns:w10="urn:schemas-microsoft-com:office:word" xmlns:w="http://schemas.openxmlformats.org/wordprocessingml/2006/main" xmlns:w14="http://schemas.microsoft.com/office/word/2010/wordml" xmlns:w15="http://schemas.microsoft.com/office/word/2012/wordml" xmlns:w16cex="http://schemas.microsoft.com/office/word/2018/wordml/cex" xmlns:w16cid="http://schemas.microsoft.com/office/word/2016/wordml/cid" xmlns:w16="http://schemas.microsoft.com/office/word/2018/wordml" xmlns:w16du="http://schemas.microsoft.com/office/word/2023/wordml/word16du" xmlns:w16sdtdh="http://schemas.microsoft.com/office/word/2020/wordml/sdtdatahash" xmlns:w16sdtfl="http://schemas.microsoft.com/office/word/2024/wordml/sdtformatlock" xmlns:w16se="http://schemas.microsoft.com/office/word/2015/wordml/symex" xmlns:wpg="http://schemas.microsoft.com/office/word/2010/wordprocessingGroup" xmlns:wpi="http://schemas.microsoft.com/office/word/2010/wordprocessingInk" xmlns:wne="http://schemas.microsoft.com/office/word/2006/wordml" xmlns:wps="http://schemas.microsoft.com/office/word/2010/wordprocessingShape" mc:Ignorable="w14 w15 w16se w16cid w16 w16cex w16sdtdh w16sdtfl w16du wp14">
+<w:hdr xmlns:wpc="http://schemas.microsoft.com/office/word/2010/wordprocessingCanvas" xmlns:cx="http://schemas.microsoft.com/office/drawing/2014/chartex" xmlns:cx1="http://schemas.microsoft.com/office/drawing/2015/9/8/chartex" xmlns:cx2="http://schemas.microsoft.com/office/drawing/2015/10/21/chartex" xmlns:cx3="http://schemas.microsoft.com/office/drawing/2016/5/9/chartex" xmlns:cx4="http://schemas.microsoft.com/office/drawing/2016/5/10/chartex" xmlns:cx5="http://schemas.microsoft.com/office/drawing/2016/5/11/chartex" xmlns:cx6="http://schemas.microsoft.com/office/drawing/2016/5/12/chartex" xmlns:cx7="http://schemas.microsoft.com/office/drawing/2016/5/13/chartex" xmlns:cx8="http://schemas.microsoft.com/office/drawing/2016/5/14/chartex" xmlns:mc="http://schemas.openxmlformats.org/markup-compatibility/2006" xmlns:aink="http://schemas.microsoft.com/office/drawing/2016/ink" xmlns:am3d="http://schemas.microsoft.com/office/drawing/2017/model3d" xmlns:o="urn:schemas-microsoft-com:office:office" xmlns:r="http://schemas.openxmlformats.org/officeDocument/2006/relationships" xmlns:m="http://schemas.openxmlformats.org/officeDocument/2006/math" xmlns:v="urn:schemas-microsoft-com:vml" xmlns:wp14="http://schemas.microsoft.com/office/word/2010/wordprocessingDrawing" xmlns:wp="http://schemas.openxmlformats.org/drawingml/2006/wordprocessingDrawing" xmlns:w10="urn:schemas-microsoft-com:office:word" xmlns:w="http://schemas.openxmlformats.org/wordprocessingml/2006/main" xmlns:w14="http://schemas.microsoft.com/office/word/2010/wordml" xmlns:w15="http://schemas.microsoft.com/office/word/2012/wordml" xmlns:w16cex="http://schemas.microsoft.com/office/word/2018/wordml/cex" xmlns:w16cid="http://schemas.microsoft.com/office/word/2016/wordml/cid" xmlns:w16="http://schemas.microsoft.com/office/word/2018/wordml" xmlns:w16sdtdh="http://schemas.microsoft.com/office/word/2020/wordml/sdtdatahash" xmlns:w16se="http://schemas.microsoft.com/office/word/2015/wordml/symex" xmlns:wpg="http://schemas.microsoft.com/office/word/2010/wordprocessingGroup" xmlns:wpi="http://schemas.microsoft.com/office/word/2010/wordprocessingInk" xmlns:wne="http://schemas.microsoft.com/office/word/2006/wordml" xmlns:wps="http://schemas.microsoft.com/office/word/2010/wordprocessingShape" mc:Ignorable="w14 w15 w16se w16cid w16 w16cex w16sdtdh wp14">
   <w:p>
     <w:pPr>
       <w:pStyle w:val="Header"/>
@@ -1200,7 +1237,7 @@
 </file>
 
 <file path=word/header2.xml><?xml version="1.0" encoding="utf-8"?>
-<w:hdr xmlns:wpc="http://schemas.microsoft.com/office/word/2010/wordprocessingCanvas" xmlns:cx="http://schemas.microsoft.com/office/drawing/2014/chartex" xmlns:cx1="http://schemas.microsoft.com/office/drawing/2015/9/8/chartex" xmlns:cx2="http://schemas.microsoft.com/office/drawing/2015/10/21/chartex" xmlns:cx3="http://schemas.microsoft.com/office/drawing/2016/5/9/chartex" xmlns:cx4="http://schemas.microsoft.com/office/drawing/2016/5/10/chartex" xmlns:cx5="http://schemas.microsoft.com/office/drawing/2016/5/11/chartex" xmlns:cx6="http://schemas.microsoft.com/office/drawing/2016/5/12/chartex" xmlns:cx7="http://schemas.microsoft.com/office/drawing/2016/5/13/chartex" xmlns:cx8="http://schemas.microsoft.com/office/drawing/2016/5/14/chartex" xmlns:mc="http://schemas.openxmlformats.org/markup-compatibility/2006" xmlns:aink="http://schemas.microsoft.com/office/drawing/2016/ink" xmlns:am3d="http://schemas.microsoft.com/office/drawing/2017/model3d" xmlns:o="urn:schemas-microsoft-com:office:office" xmlns:oel="http://schemas.microsoft.com/office/2019/extlst" xmlns:r="http://schemas.openxmlformats.org/officeDocument/2006/relationships" xmlns:m="http://schemas.openxmlformats.org/officeDocument/2006/math" xmlns:v="urn:schemas-microsoft-com:vml" xmlns:wp14="http://schemas.microsoft.com/office/word/2010/wordprocessingDrawing" xmlns:wp="http://schemas.openxmlformats.org/drawingml/2006/wordprocessingDrawing" xmlns:w10="urn:schemas-microsoft-com:office:word" xmlns:w="http://schemas.openxmlformats.org/wordprocessingml/2006/main" xmlns:w14="http://schemas.microsoft.com/office/word/2010/wordml" xmlns:w15="http://schemas.microsoft.com/office/word/2012/wordml" xmlns:w16cex="http://schemas.microsoft.com/office/word/2018/wordml/cex" xmlns:w16cid="http://schemas.microsoft.com/office/word/2016/wordml/cid" xmlns:w16="http://schemas.microsoft.com/office/word/2018/wordml" xmlns:w16du="http://schemas.microsoft.com/office/word/2023/wordml/word16du" xmlns:w16sdtdh="http://schemas.microsoft.com/office/word/2020/wordml/sdtdatahash" xmlns:w16sdtfl="http://schemas.microsoft.com/office/word/2024/wordml/sdtformatlock" xmlns:w16se="http://schemas.microsoft.com/office/word/2015/wordml/symex" xmlns:wpg="http://schemas.microsoft.com/office/word/2010/wordprocessingGroup" xmlns:wpi="http://schemas.microsoft.com/office/word/2010/wordprocessingInk" xmlns:wne="http://schemas.microsoft.com/office/word/2006/wordml" xmlns:wps="http://schemas.microsoft.com/office/word/2010/wordprocessingShape" mc:Ignorable="w14 w15 w16se w16cid w16 w16cex w16sdtdh w16sdtfl w16du wp14">
+<w:hdr xmlns:wpc="http://schemas.microsoft.com/office/word/2010/wordprocessingCanvas" xmlns:cx="http://schemas.microsoft.com/office/drawing/2014/chartex" xmlns:cx1="http://schemas.microsoft.com/office/drawing/2015/9/8/chartex" xmlns:cx2="http://schemas.microsoft.com/office/drawing/2015/10/21/chartex" xmlns:cx3="http://schemas.microsoft.com/office/drawing/2016/5/9/chartex" xmlns:cx4="http://schemas.microsoft.com/office/drawing/2016/5/10/chartex" xmlns:cx5="http://schemas.microsoft.com/office/drawing/2016/5/11/chartex" xmlns:cx6="http://schemas.microsoft.com/office/drawing/2016/5/12/chartex" xmlns:cx7="http://schemas.microsoft.com/office/drawing/2016/5/13/chartex" xmlns:cx8="http://schemas.microsoft.com/office/drawing/2016/5/14/chartex" xmlns:mc="http://schemas.openxmlformats.org/markup-compatibility/2006" xmlns:aink="http://schemas.microsoft.com/office/drawing/2016/ink" xmlns:am3d="http://schemas.microsoft.com/office/drawing/2017/model3d" xmlns:o="urn:schemas-microsoft-com:office:office" xmlns:r="http://schemas.openxmlformats.org/officeDocument/2006/relationships" xmlns:m="http://schemas.openxmlformats.org/officeDocument/2006/math" xmlns:v="urn:schemas-microsoft-com:vml" xmlns:wp14="http://schemas.microsoft.com/office/word/2010/wordprocessingDrawing" xmlns:wp="http://schemas.openxmlformats.org/drawingml/2006/wordprocessingDrawing" xmlns:w10="urn:schemas-microsoft-com:office:word" xmlns:w="http://schemas.openxmlformats.org/wordprocessingml/2006/main" xmlns:w14="http://schemas.microsoft.com/office/word/2010/wordml" xmlns:w15="http://schemas.microsoft.com/office/word/2012/wordml" xmlns:w16cex="http://schemas.microsoft.com/office/word/2018/wordml/cex" xmlns:w16cid="http://schemas.microsoft.com/office/word/2016/wordml/cid" xmlns:w16="http://schemas.microsoft.com/office/word/2018/wordml" xmlns:w16sdtdh="http://schemas.microsoft.com/office/word/2020/wordml/sdtdatahash" xmlns:w16se="http://schemas.microsoft.com/office/word/2015/wordml/symex" xmlns:wpg="http://schemas.microsoft.com/office/word/2010/wordprocessingGroup" xmlns:wpi="http://schemas.microsoft.com/office/word/2010/wordprocessingInk" xmlns:wne="http://schemas.microsoft.com/office/word/2006/wordml" xmlns:wps="http://schemas.microsoft.com/office/word/2010/wordprocessingShape" mc:Ignorable="w14 w15 w16se w16cid w16 w16cex w16sdtdh wp14">
   <w:p>
     <w:pPr>
       <w:keepNext/>
@@ -1451,7 +1488,7 @@
             </wp:anchor>
           </w:drawing>
         </mc:Choice>
-        <mc:Fallback>
+        <mc:Fallback xmlns:w16sdtfl="http://schemas.microsoft.com/office/word/2024/wordml/sdtformatlock" xmlns:w16du="http://schemas.microsoft.com/office/word/2023/wordml/word16du" xmlns:oel="http://schemas.microsoft.com/office/2019/extlst">
           <w:pict>
             <v:line w14:anchorId="47397A85" id="Line 5" o:spid="_x0000_s1026" style="position:absolute;z-index:-251657216;visibility:visible;mso-wrap-style:square;mso-width-percent:0;mso-wrap-distance-left:9pt;mso-wrap-distance-top:0;mso-wrap-distance-right:9pt;mso-wrap-distance-bottom:0;mso-position-horizontal:absolute;mso-position-horizontal-relative:text;mso-position-vertical:absolute;mso-position-vertical-relative:text;mso-width-percent:0;mso-width-relative:margin" from="32.15pt,10.9pt" to="453.25pt,10.9pt" o:gfxdata="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" strokeweight="1.5pt"/>
           </w:pict>
@@ -1471,7 +1508,7 @@
 </file>
 
 <file path=word/header3.xml><?xml version="1.0" encoding="utf-8"?>
-<w:hdr xmlns:wpc="http://schemas.microsoft.com/office/word/2010/wordprocessingCanvas" xmlns:cx="http://schemas.microsoft.com/office/drawing/2014/chartex" xmlns:cx1="http://schemas.microsoft.com/office/drawing/2015/9/8/chartex" xmlns:cx2="http://schemas.microsoft.com/office/drawing/2015/10/21/chartex" xmlns:cx3="http://schemas.microsoft.com/office/drawing/2016/5/9/chartex" xmlns:cx4="http://schemas.microsoft.com/office/drawing/2016/5/10/chartex" xmlns:cx5="http://schemas.microsoft.com/office/drawing/2016/5/11/chartex" xmlns:cx6="http://schemas.microsoft.com/office/drawing/2016/5/12/chartex" xmlns:cx7="http://schemas.microsoft.com/office/drawing/2016/5/13/chartex" xmlns:cx8="http://schemas.microsoft.com/office/drawing/2016/5/14/chartex" xmlns:mc="http://schemas.openxmlformats.org/markup-compatibility/2006" xmlns:aink="http://schemas.microsoft.com/office/drawing/2016/ink" xmlns:am3d="http://schemas.microsoft.com/office/drawing/2017/model3d" xmlns:o="urn:schemas-microsoft-com:office:office" xmlns:oel="http://schemas.microsoft.com/office/2019/extlst" xmlns:r="http://schemas.openxmlformats.org/officeDocument/2006/relationships" xmlns:m="http://schemas.openxmlformats.org/officeDocument/2006/math" xmlns:v="urn:schemas-microsoft-com:vml" xmlns:wp14="http://schemas.microsoft.com/office/word/2010/wordprocessingDrawing" xmlns:wp="http://schemas.openxmlformats.org/drawingml/2006/wordprocessingDrawing" xmlns:w10="urn:schemas-microsoft-com:office:word" xmlns:w="http://schemas.openxmlformats.org/wordprocessingml/2006/main" xmlns:w14="http://schemas.microsoft.com/office/word/2010/wordml" xmlns:w15="http://schemas.microsoft.com/office/word/2012/wordml" xmlns:w16cex="http://schemas.microsoft.com/office/word/2018/wordml/cex" xmlns:w16cid="http://schemas.microsoft.com/office/word/2016/wordml/cid" xmlns:w16="http://schemas.microsoft.com/office/word/2018/wordml" xmlns:w16du="http://schemas.microsoft.com/office/word/2023/wordml/word16du" xmlns:w16sdtdh="http://schemas.microsoft.com/office/word/2020/wordml/sdtdatahash" xmlns:w16sdtfl="http://schemas.microsoft.com/office/word/2024/wordml/sdtformatlock" xmlns:w16se="http://schemas.microsoft.com/office/word/2015/wordml/symex" xmlns:wpg="http://schemas.microsoft.com/office/word/2010/wordprocessingGroup" xmlns:wpi="http://schemas.microsoft.com/office/word/2010/wordprocessingInk" xmlns:wne="http://schemas.microsoft.com/office/word/2006/wordml" xmlns:wps="http://schemas.microsoft.com/office/word/2010/wordprocessingShape" mc:Ignorable="w14 w15 w16se w16cid w16 w16cex w16sdtdh w16sdtfl w16du wp14">
+<w:hdr xmlns:wpc="http://schemas.microsoft.com/office/word/2010/wordprocessingCanvas" xmlns:cx="http://schemas.microsoft.com/office/drawing/2014/chartex" xmlns:cx1="http://schemas.microsoft.com/office/drawing/2015/9/8/chartex" xmlns:cx2="http://schemas.microsoft.com/office/drawing/2015/10/21/chartex" xmlns:cx3="http://schemas.microsoft.com/office/drawing/2016/5/9/chartex" xmlns:cx4="http://schemas.microsoft.com/office/drawing/2016/5/10/chartex" xmlns:cx5="http://schemas.microsoft.com/office/drawing/2016/5/11/chartex" xmlns:cx6="http://schemas.microsoft.com/office/drawing/2016/5/12/chartex" xmlns:cx7="http://schemas.microsoft.com/office/drawing/2016/5/13/chartex" xmlns:cx8="http://schemas.microsoft.com/office/drawing/2016/5/14/chartex" xmlns:mc="http://schemas.openxmlformats.org/markup-compatibility/2006" xmlns:aink="http://schemas.microsoft.com/office/drawing/2016/ink" xmlns:am3d="http://schemas.microsoft.com/office/drawing/2017/model3d" xmlns:o="urn:schemas-microsoft-com:office:office" xmlns:r="http://schemas.openxmlformats.org/officeDocument/2006/relationships" xmlns:m="http://schemas.openxmlformats.org/officeDocument/2006/math" xmlns:v="urn:schemas-microsoft-com:vml" xmlns:wp14="http://schemas.microsoft.com/office/word/2010/wordprocessingDrawing" xmlns:wp="http://schemas.openxmlformats.org/drawingml/2006/wordprocessingDrawing" xmlns:w10="urn:schemas-microsoft-com:office:word" xmlns:w="http://schemas.openxmlformats.org/wordprocessingml/2006/main" xmlns:w14="http://schemas.microsoft.com/office/word/2010/wordml" xmlns:w15="http://schemas.microsoft.com/office/word/2012/wordml" xmlns:w16cex="http://schemas.microsoft.com/office/word/2018/wordml/cex" xmlns:w16cid="http://schemas.microsoft.com/office/word/2016/wordml/cid" xmlns:w16="http://schemas.microsoft.com/office/word/2018/wordml" xmlns:w16sdtdh="http://schemas.microsoft.com/office/word/2020/wordml/sdtdatahash" xmlns:w16se="http://schemas.microsoft.com/office/word/2015/wordml/symex" xmlns:wpg="http://schemas.microsoft.com/office/word/2010/wordprocessingGroup" xmlns:wpi="http://schemas.microsoft.com/office/word/2010/wordprocessingInk" xmlns:wne="http://schemas.microsoft.com/office/word/2006/wordml" xmlns:wps="http://schemas.microsoft.com/office/word/2010/wordprocessingShape" mc:Ignorable="w14 w15 w16se w16cid w16 w16cex w16sdtdh wp14">
   <w:p>
     <w:pPr>
       <w:pStyle w:val="Header"/>
@@ -1481,7 +1518,7 @@
 </file>
 
 <file path=word/numbering.xml><?xml version="1.0" encoding="utf-8"?>
-<w:numbering xmlns:wpc="http://schemas.microsoft.com/office/word/2010/wordprocessingCanvas" xmlns:cx="http://schemas.microsoft.com/office/drawing/2014/chartex" xmlns:cx1="http://schemas.microsoft.com/office/drawing/2015/9/8/chartex" xmlns:cx2="http://schemas.microsoft.com/office/drawing/2015/10/21/chartex" xmlns:cx3="http://schemas.microsoft.com/office/drawing/2016/5/9/chartex" xmlns:cx4="http://schemas.microsoft.com/office/drawing/2016/5/10/chartex" xmlns:cx5="http://schemas.microsoft.com/office/drawing/2016/5/11/chartex" xmlns:cx6="http://schemas.microsoft.com/office/drawing/2016/5/12/chartex" xmlns:cx7="http://schemas.microsoft.com/office/drawing/2016/5/13/chartex" xmlns:cx8="http://schemas.microsoft.com/office/drawing/2016/5/14/chartex" xmlns:mc="http://schemas.openxmlformats.org/markup-compatibility/2006" xmlns:aink="http://schemas.microsoft.com/office/drawing/2016/ink" xmlns:am3d="http://schemas.microsoft.com/office/drawing/2017/model3d" xmlns:o="urn:schemas-microsoft-com:office:office" xmlns:oel="http://schemas.microsoft.com/office/2019/extlst" xmlns:r="http://schemas.openxmlformats.org/officeDocument/2006/relationships" xmlns:m="http://schemas.openxmlformats.org/officeDocument/2006/math" xmlns:v="urn:schemas-microsoft-com:vml" xmlns:wp14="http://schemas.microsoft.com/office/word/2010/wordprocessingDrawing" xmlns:wp="http://schemas.openxmlformats.org/drawingml/2006/wordprocessingDrawing" xmlns:w10="urn:schemas-microsoft-com:office:word" xmlns:w="http://schemas.openxmlformats.org/wordprocessingml/2006/main" xmlns:w14="http://schemas.microsoft.com/office/word/2010/wordml" xmlns:w15="http://schemas.microsoft.com/office/word/2012/wordml" xmlns:w16cex="http://schemas.microsoft.com/office/word/2018/wordml/cex" xmlns:w16cid="http://schemas.microsoft.com/office/word/2016/wordml/cid" xmlns:w16="http://schemas.microsoft.com/office/word/2018/wordml" xmlns:w16du="http://schemas.microsoft.com/office/word/2023/wordml/word16du" xmlns:w16sdtdh="http://schemas.microsoft.com/office/word/2020/wordml/sdtdatahash" xmlns:w16sdtfl="http://schemas.microsoft.com/office/word/2024/wordml/sdtformatlock" xmlns:w16se="http://schemas.microsoft.com/office/word/2015/wordml/symex" xmlns:wpg="http://schemas.microsoft.com/office/word/2010/wordprocessingGroup" xmlns:wpi="http://schemas.microsoft.com/office/word/2010/wordprocessingInk" xmlns:wne="http://schemas.microsoft.com/office/word/2006/wordml" xmlns:wps="http://schemas.microsoft.com/office/word/2010/wordprocessingShape" mc:Ignorable="w14 w15 w16se w16cid w16 w16cex w16sdtdh w16sdtfl w16du wp14">
+<w:numbering xmlns:wpc="http://schemas.microsoft.com/office/word/2010/wordprocessingCanvas" xmlns:cx="http://schemas.microsoft.com/office/drawing/2014/chartex" xmlns:cx1="http://schemas.microsoft.com/office/drawing/2015/9/8/chartex" xmlns:cx2="http://schemas.microsoft.com/office/drawing/2015/10/21/chartex" xmlns:cx3="http://schemas.microsoft.com/office/drawing/2016/5/9/chartex" xmlns:cx4="http://schemas.microsoft.com/office/drawing/2016/5/10/chartex" xmlns:cx5="http://schemas.microsoft.com/office/drawing/2016/5/11/chartex" xmlns:cx6="http://schemas.microsoft.com/office/drawing/2016/5/12/chartex" xmlns:cx7="http://schemas.microsoft.com/office/drawing/2016/5/13/chartex" xmlns:cx8="http://schemas.microsoft.com/office/drawing/2016/5/14/chartex" xmlns:mc="http://schemas.openxmlformats.org/markup-compatibility/2006" xmlns:aink="http://schemas.microsoft.com/office/drawing/2016/ink" xmlns:am3d="http://schemas.microsoft.com/office/drawing/2017/model3d" xmlns:o="urn:schemas-microsoft-com:office:office" xmlns:r="http://schemas.openxmlformats.org/officeDocument/2006/relationships" xmlns:m="http://schemas.openxmlformats.org/officeDocument/2006/math" xmlns:v="urn:schemas-microsoft-com:vml" xmlns:wp14="http://schemas.microsoft.com/office/word/2010/wordprocessingDrawing" xmlns:wp="http://schemas.openxmlformats.org/drawingml/2006/wordprocessingDrawing" xmlns:w10="urn:schemas-microsoft-com:office:word" xmlns:w="http://schemas.openxmlformats.org/wordprocessingml/2006/main" xmlns:w14="http://schemas.microsoft.com/office/word/2010/wordml" xmlns:w15="http://schemas.microsoft.com/office/word/2012/wordml" xmlns:w16cex="http://schemas.microsoft.com/office/word/2018/wordml/cex" xmlns:w16cid="http://schemas.microsoft.com/office/word/2016/wordml/cid" xmlns:w16="http://schemas.microsoft.com/office/word/2018/wordml" xmlns:w16sdtdh="http://schemas.microsoft.com/office/word/2020/wordml/sdtdatahash" xmlns:w16se="http://schemas.microsoft.com/office/word/2015/wordml/symex" xmlns:wpg="http://schemas.microsoft.com/office/word/2010/wordprocessingGroup" xmlns:wpi="http://schemas.microsoft.com/office/word/2010/wordprocessingInk" xmlns:wne="http://schemas.microsoft.com/office/word/2006/wordml" xmlns:wps="http://schemas.microsoft.com/office/word/2010/wordprocessingShape" mc:Ignorable="w14 w15 w16se w16cid w16 w16cex w16sdtdh wp14">
   <w:abstractNum w:abstractNumId="0" w15:restartNumberingAfterBreak="0">
     <w:nsid w:val="67C967D3"/>
     <w:multiLevelType w:val="hybridMultilevel"/>
@@ -1571,14 +1608,14 @@
       </w:pPr>
     </w:lvl>
   </w:abstractNum>
-  <w:num w:numId="1" w16cid:durableId="1448962735">
+  <w:num w:numId="1">
     <w:abstractNumId w:val="0"/>
   </w:num>
 </w:numbering>
 </file>
 
 <file path=word/styles.xml><?xml version="1.0" encoding="utf-8"?>
-<w:styles xmlns:mc="http://schemas.openxmlformats.org/markup-compatibility/2006" xmlns:r="http://schemas.openxmlformats.org/officeDocument/2006/relationships" xmlns:w="http://schemas.openxmlformats.org/wordprocessingml/2006/main" xmlns:w14="http://schemas.microsoft.com/office/word/2010/wordml" xmlns:w15="http://schemas.microsoft.com/office/word/2012/wordml" xmlns:w16cex="http://schemas.microsoft.com/office/word/2018/wordml/cex" xmlns:w16cid="http://schemas.microsoft.com/office/word/2016/wordml/cid" xmlns:w16="http://schemas.microsoft.com/office/word/2018/wordml" xmlns:w16du="http://schemas.microsoft.com/office/word/2023/wordml/word16du" xmlns:w16sdtdh="http://schemas.microsoft.com/office/word/2020/wordml/sdtdatahash" xmlns:w16sdtfl="http://schemas.microsoft.com/office/word/2024/wordml/sdtformatlock" xmlns:w16se="http://schemas.microsoft.com/office/word/2015/wordml/symex" mc:Ignorable="w14 w15 w16se w16cid w16 w16cex w16sdtdh w16sdtfl w16du">
+<w:styles xmlns:mc="http://schemas.openxmlformats.org/markup-compatibility/2006" xmlns:r="http://schemas.openxmlformats.org/officeDocument/2006/relationships" xmlns:w="http://schemas.openxmlformats.org/wordprocessingml/2006/main" xmlns:w14="http://schemas.microsoft.com/office/word/2010/wordml" xmlns:w15="http://schemas.microsoft.com/office/word/2012/wordml" xmlns:w16cex="http://schemas.microsoft.com/office/word/2018/wordml/cex" xmlns:w16cid="http://schemas.microsoft.com/office/word/2016/wordml/cid" xmlns:w16="http://schemas.microsoft.com/office/word/2018/wordml" xmlns:w16sdtdh="http://schemas.microsoft.com/office/word/2020/wordml/sdtdatahash" xmlns:w16se="http://schemas.microsoft.com/office/word/2015/wordml/symex" mc:Ignorable="w14 w15 w16se w16cid w16 w16cex w16sdtdh">
   <w:docDefaults>
     <w:rPrDefault>
       <w:rPr>
@@ -2909,12 +2946,15 @@
 </file>
 
 <file path=customXml/item1.xml><?xml version="1.0" encoding="utf-8"?>
-<?mso-contentType ?>
-<FormTemplates xmlns="http://schemas.microsoft.com/sharepoint/v3/contenttype/forms">
-  <Display>DocumentLibraryForm</Display>
-  <Edit>DocumentLibraryForm</Edit>
-  <New>DocumentLibraryForm</New>
-</FormTemplates>
+<p:properties xmlns:p="http://schemas.microsoft.com/office/2006/metadata/properties" xmlns:xsi="http://www.w3.org/2001/XMLSchema-instance" xmlns:pc="http://schemas.microsoft.com/office/infopath/2007/PartnerControls">
+  <documentManagement>
+    <lcf76f155ced4ddcb4097134ff3c332f xmlns="87f1a149-5420-40c2-b2e8-d8d0877ebc85">
+      <Terms xmlns="http://schemas.microsoft.com/office/infopath/2007/PartnerControls"/>
+    </lcf76f155ced4ddcb4097134ff3c332f>
+    <TaxCatchAll xmlns="23b7ebbb-480e-4d36-8f38-fd0ac82dae9c" xsi:nil="true"/>
+    <PIC xmlns="87f1a149-5420-40c2-b2e8-d8d0877ebc85" xsi:nil="true"/>
+  </documentManagement>
+</p:properties>
 </file>
 
 <file path=customXml/item2.xml><?xml version="1.0" encoding="utf-8"?>
@@ -3161,21 +3201,21 @@
 </file>
 
 <file path=customXml/item3.xml><?xml version="1.0" encoding="utf-8"?>
-<p:properties xmlns:p="http://schemas.microsoft.com/office/2006/metadata/properties" xmlns:xsi="http://www.w3.org/2001/XMLSchema-instance" xmlns:pc="http://schemas.microsoft.com/office/infopath/2007/PartnerControls">
-  <documentManagement>
-    <lcf76f155ced4ddcb4097134ff3c332f xmlns="87f1a149-5420-40c2-b2e8-d8d0877ebc85">
-      <Terms xmlns="http://schemas.microsoft.com/office/infopath/2007/PartnerControls"/>
-    </lcf76f155ced4ddcb4097134ff3c332f>
-    <TaxCatchAll xmlns="23b7ebbb-480e-4d36-8f38-fd0ac82dae9c" xsi:nil="true"/>
-    <PIC xmlns="87f1a149-5420-40c2-b2e8-d8d0877ebc85" xsi:nil="true"/>
-  </documentManagement>
-</p:properties>
+<?mso-contentType ?>
+<FormTemplates xmlns="http://schemas.microsoft.com/sharepoint/v3/contenttype/forms">
+  <Display>DocumentLibraryForm</Display>
+  <Edit>DocumentLibraryForm</Edit>
+  <New>DocumentLibraryForm</New>
+</FormTemplates>
 </file>
 
 <file path=customXml/itemProps1.xml><?xml version="1.0" encoding="utf-8"?>
-<ds:datastoreItem xmlns:ds="http://schemas.openxmlformats.org/officeDocument/2006/customXml" ds:itemID="{28C6D441-23EB-41B4-AB5D-D516FBB4D9B5}">
+<ds:datastoreItem xmlns:ds="http://schemas.openxmlformats.org/officeDocument/2006/customXml" ds:itemID="{76147286-6750-44A4-B829-827B6E824193}">
   <ds:schemaRefs>
-    <ds:schemaRef ds:uri="http://schemas.microsoft.com/sharepoint/v3/contenttype/forms"/>
+    <ds:schemaRef ds:uri="http://schemas.microsoft.com/office/2006/metadata/properties"/>
+    <ds:schemaRef ds:uri="http://schemas.microsoft.com/office/infopath/2007/PartnerControls"/>
+    <ds:schemaRef ds:uri="87f1a149-5420-40c2-b2e8-d8d0877ebc85"/>
+    <ds:schemaRef ds:uri="23b7ebbb-480e-4d36-8f38-fd0ac82dae9c"/>
   </ds:schemaRefs>
 </ds:datastoreItem>
 </file>
@@ -3200,12 +3240,9 @@
 </file>
 
 <file path=customXml/itemProps3.xml><?xml version="1.0" encoding="utf-8"?>
-<ds:datastoreItem xmlns:ds="http://schemas.openxmlformats.org/officeDocument/2006/customXml" ds:itemID="{76147286-6750-44A4-B829-827B6E824193}">
+<ds:datastoreItem xmlns:ds="http://schemas.openxmlformats.org/officeDocument/2006/customXml" ds:itemID="{28C6D441-23EB-41B4-AB5D-D516FBB4D9B5}">
   <ds:schemaRefs>
-    <ds:schemaRef ds:uri="http://schemas.microsoft.com/office/2006/metadata/properties"/>
-    <ds:schemaRef ds:uri="http://schemas.microsoft.com/office/infopath/2007/PartnerControls"/>
-    <ds:schemaRef ds:uri="87f1a149-5420-40c2-b2e8-d8d0877ebc85"/>
-    <ds:schemaRef ds:uri="23b7ebbb-480e-4d36-8f38-fd0ac82dae9c"/>
+    <ds:schemaRef ds:uri="http://schemas.microsoft.com/sharepoint/v3/contenttype/forms"/>
   </ds:schemaRefs>
 </ds:datastoreItem>
 </file>
</xml_diff>